<commit_message>
Define o UC05 como caso de uso da arquitetura
Planejamento do Sprint 3 (#22):

- PCP: a arquitetura é definida e testada com o UC05 (Manter Veículo).
  UC03 (início e previsão) e UC04 passam para o sprint 5, o primeiro da
  Construção. As tarefas 11, 14 e 22 do Backlog trocaram de caso de uso
  e mantiveram as horas, a reestimar no Planning Poker.
- Produtos dos sprints 3 a 5 ajustados, com os diagramas pedidos pelo
  professor no sprint 3.
- RI-08 atualizado na PCP, no Visão (v4.1) e no Documento de
  Requisitos (v1.1).
</commit_message>
<xml_diff>
--- a/1.Requisitos/CARREGAJA - Documento de Requisitos.docx
+++ b/1.Requisitos/CARREGAJA - Documento de Requisitos.docx
@@ -15,7 +15,7 @@
         <w:pStyle w:val="Titulodocumento"/>
       </w:pPr>
       <w:r>
-        <w:t>Versão 1.0</w:t>
+        <w:t>Versão 1.1</w:t>
       </w:r>
     </w:p>
     <w:p>
@@ -204,6 +204,67 @@
           </w:p>
         </w:tc>
       </w:tr>
+      <w:tr>
+        <w:trPr>
+          <w:cantSplit/>
+        </w:trPr>
+        <w:tc>
+          <w:tcPr>
+            <w:tcW w:w="618" w:type="pct"/>
+          </w:tcPr>
+          <w:p>
+            <w:pPr>
+              <w:spacing w:after="40"/>
+              <w:jc w:val="left"/>
+            </w:pPr>
+            <w:r>
+              <w:t>26/09/2026</w:t>
+            </w:r>
+          </w:p>
+        </w:tc>
+        <w:tc>
+          <w:tcPr>
+            <w:tcW w:w="449" w:type="pct"/>
+          </w:tcPr>
+          <w:p>
+            <w:pPr>
+              <w:spacing w:after="40"/>
+              <w:jc w:val="left"/>
+            </w:pPr>
+            <w:r>
+              <w:t>1.1</w:t>
+            </w:r>
+          </w:p>
+        </w:tc>
+        <w:tc>
+          <w:tcPr>
+            <w:tcW w:w="2997" w:type="pct"/>
+          </w:tcPr>
+          <w:p>
+            <w:pPr>
+              <w:spacing w:after="40"/>
+              <w:jc w:val="left"/>
+            </w:pPr>
+            <w:r>
+              <w:t>RI-08: a arquitetura passa a ser testada com o UC05 (Manter Veículo), e a previsão e a apuração vão para o início da Construção.</w:t>
+            </w:r>
+          </w:p>
+        </w:tc>
+        <w:tc>
+          <w:tcPr>
+            <w:tcW w:w="937" w:type="pct"/>
+          </w:tcPr>
+          <w:p>
+            <w:pPr>
+              <w:spacing w:after="40"/>
+              <w:jc w:val="left"/>
+            </w:pPr>
+            <w:r>
+              <w:t>Henrique de Almeida Marangoni Inacio</w:t>
+            </w:r>
+          </w:p>
+        </w:tc>
+      </w:tr>
     </w:tbl>
     <w:p>
       <w:pPr>
@@ -500,10 +561,7 @@
     </w:p>
     <w:p>
       <w:r>
-        <w:t xml:space="preserve">Condomínios residenciais verticais vêm instalando pontos de recarga para veículos elétricos nas áreas comuns da garagem. O número de pontos é pequeno, tipicamente de um a quatro, e é </w:t>
-      </w:r>
-      <w:r>
-        <w:t>compartilhado por dezenas de apartamentos. A energia consumida sai da conta de luz da área comum, paga por todos os condôminos, inclusive por quem não possui veículo elétrico.</w:t>
+        <w:t>Condomínios residenciais verticais vêm instalando pontos de recarga para veículos elétricos nas áreas comuns da garagem. O número de pontos é pequeno, tipicamente de um a quatro, e é compartilhado por dezenas de apartamentos. A energia consumida sai da conta de luz da área comum, paga por todos os condôminos, inclusive por quem não possui veículo elétrico.</w:t>
       </w:r>
     </w:p>
     <w:p>
@@ -521,7 +579,10 @@
         <w:t>disputa pelo recurso</w:t>
       </w:r>
       <w:r>
-        <w:t xml:space="preserve">: o morador desce à garagem sem saber se encontrará ponto livre e, quando encontra tudo ocupado, não tem como saber quando algum será liberado. O segundo é de </w:t>
+        <w:t xml:space="preserve">: o morador </w:t>
+      </w:r>
+      <w:r>
+        <w:t xml:space="preserve">desce à garagem sem saber se encontrará ponto livre e, quando encontra tudo ocupado, não tem como saber quando algum será liberado. O segundo é de </w:t>
       </w:r>
       <w:r>
         <w:rPr>
@@ -531,10 +592,11 @@
         <w:t>rateio</w:t>
       </w:r>
       <w:r>
-        <w:t xml:space="preserve">: sem registro de quem usou, por </w:t>
+        <w:t xml:space="preserve">: sem registro de quem usou, por quanto tempo e com qual veículo, o condomínio não individualiza o custo, e a energia de poucos acaba dividida entre todos. Os </w:t>
       </w:r>
       <w:r>
-        <w:t>quanto tempo e com qual veículo, o condomínio não individualiza o custo, e a energia de poucos acaba dividida entre todos. Os controles paralelos hoje usados (grupo de mensagens, planilha do síndico, rodízio informal) não produzem número defensável para lançar na cota condominial.</w:t>
+        <w:lastRenderedPageBreak/>
+        <w:t>controles paralelos hoje usados (grupo de mensagens, planilha do síndico, rodízio informal) não produzem número defensável para lançar na cota condominial.</w:t>
       </w:r>
     </w:p>
     <w:p>
@@ -549,14 +611,10 @@
         <w:t>Origem dos requisitos.</w:t>
       </w:r>
       <w:r>
-        <w:t xml:space="preserve"> O projeto é conduzido em contexto acadêmico e não dispõe de cliente externo contratante. As necessidades foram levantadas pela equipe a partir da análise do </w:t>
+        <w:t xml:space="preserve"> </w:t>
       </w:r>
       <w:r>
-        <w:t xml:space="preserve">domínio, e o Product </w:t>
-      </w:r>
-      <w:r>
-        <w:lastRenderedPageBreak/>
-        <w:t>Owner atua como representante do cliente para aprovação do escopo e do planejamento, conforme previsto no SpinOff para o papel (RE-16).</w:t>
+        <w:t>O projeto é conduzido em contexto acadêmico e não dispõe de cliente externo contratante. As necessidades foram levantadas pela equipe a partir da análise do domínio, e o Product Owner atua como representante do cliente para aprovação do escopo e do planejamento, conforme previsto no SpinOff para o papel (RE-16).</w:t>
       </w:r>
     </w:p>
     <w:p>
@@ -708,10 +766,7 @@
               <w:t>Não</w:t>
             </w:r>
             <w:r>
-              <w:t xml:space="preserve"> </w:t>
-            </w:r>
-            <w:r>
-              <w:t xml:space="preserve">altera tarifa, </w:t>
+              <w:t xml:space="preserve"> altera tarifa, </w:t>
             </w:r>
             <w:r>
               <w:rPr>
@@ -796,10 +851,7 @@
         <w:t>Acumulação de perfis.</w:t>
       </w:r>
       <w:r>
-        <w:t xml:space="preserve"> O síndico é também condômino e pode possuir veículo elétrico. Nesse </w:t>
-      </w:r>
-      <w:r>
-        <w:t>caso acumula os dois perfis: usa o sistema como morador para as próprias recargas, apuradas e rateadas como as demais, e como síndico para a gestão. As ações de gestão ficam registradas com o usuário que as realizou.</w:t>
+        <w:t xml:space="preserve"> O síndico é também condômino e pode possuir veículo elétrico. Nesse caso acumula os dois perfis: usa o sistema como morador para as próprias recargas, apuradas e rateadas como as demais, e como síndico para a gestão. As ações de gestão ficam registradas com o usuário que as realizou.</w:t>
       </w:r>
     </w:p>
     <w:p>
@@ -1665,7 +1717,11 @@
               <w:jc w:val="left"/>
             </w:pPr>
             <w:r>
-              <w:t>RF-17</w:t>
+              <w:t>RF-</w:t>
+            </w:r>
+            <w:r>
+              <w:lastRenderedPageBreak/>
+              <w:t>17</w:t>
             </w:r>
           </w:p>
         </w:tc>
@@ -1679,7 +1735,12 @@
               <w:jc w:val="left"/>
             </w:pPr>
             <w:r>
-              <w:t>Exibir o histórico de utilização por vaga, apartamento e período, com as tentativas recusadas por falta de vaga.</w:t>
+              <w:lastRenderedPageBreak/>
+              <w:t xml:space="preserve">Exibir o histórico de utilização por vaga, apartamento e período, com as tentativas </w:t>
+            </w:r>
+            <w:r>
+              <w:lastRenderedPageBreak/>
+              <w:t>recusadas por falta de vaga.</w:t>
             </w:r>
           </w:p>
         </w:tc>
@@ -1693,6 +1754,7 @@
               <w:jc w:val="left"/>
             </w:pPr>
             <w:r>
+              <w:lastRenderedPageBreak/>
               <w:t>UC12</w:t>
             </w:r>
           </w:p>
@@ -1752,14 +1814,10 @@
           <w:b/>
           <w:bCs/>
         </w:rPr>
-        <w:lastRenderedPageBreak/>
         <w:t>RF-18 ainda não tem caso de uso.</w:t>
       </w:r>
       <w:r>
-        <w:t xml:space="preserve"> O Visão e a análise de riscos (RI-10) tratam a duração máxima como parâmetro ajustável pelo síndico, mas nenhum caso de uso do modelo cobre essa </w:t>
-      </w:r>
-      <w:r>
-        <w:t>configuração. Fica registrado como pendência para a Elaboração.</w:t>
+        <w:t xml:space="preserve"> O Visão e a análise de riscos (RI-10) tratam a duração máxima como parâmetro ajustável pelo síndico, mas nenhum caso de uso do modelo cobre essa configuração. Fica registrado como pendência para a Elaboração.</w:t>
       </w:r>
     </w:p>
     <w:p>
@@ -2069,7 +2127,10 @@
               <w:t>Potência efetiva</w:t>
             </w:r>
             <w:r>
-              <w:t xml:space="preserve"> = min(potência do carregador, potência máxima do veículo). Um carregador de 22 kW não recarrega mais rápido um veículo que aceita no máximo 6,6 kW.</w:t>
+              <w:t xml:space="preserve"> </w:t>
+            </w:r>
+            <w:r>
+              <w:t>= min(potência do carregador, potência máxima do veículo). Um carregador de 22 kW não recarrega mais rápido um veículo que aceita no máximo 6,6 kW.</w:t>
             </w:r>
           </w:p>
         </w:tc>
@@ -2382,7 +2443,10 @@
         <w:t>Por que a apuração é por energia, e não por tempo.</w:t>
       </w:r>
       <w:r>
-        <w:t xml:space="preserve"> Na versão 1.1 do Visão, com motorista anônimo, cobrar por tempo evitava que se subdeclarasse a potência para pagar menos. Aqui o morador é identificado, recorrente, e cadastra o veículo uma única vez, sob vista do síndico. A brecha fecha, e a energia passa a ser a unidade certa: é em kWh que a concessionária cobra o condomínio, e é isso que o rateio devolve.</w:t>
+        <w:t xml:space="preserve"> Na versão 1.1 do Visão, com motorista </w:t>
+      </w:r>
+      <w:r>
+        <w:t>anônimo, cobrar por tempo evitava que se subdeclarasse a potência para pagar menos. Aqui o morador é identificado, recorrente, e cadastra o veículo uma única vez, sob vista do síndico. A brecha fecha, e a energia passa a ser a unidade certa: é em kWh que a concessionária cobra o condomínio, e é isso que o rateio devolve.</w:t>
       </w:r>
     </w:p>
     <w:p>
@@ -2394,10 +2458,10 @@
         <w:t>Consequência aceita:</w:t>
       </w:r>
       <w:r>
-        <w:t xml:space="preserve"> </w:t>
+        <w:t xml:space="preserve"> como a energia é limitada pela carga que faltava (RN-03), ocupar a vaga depois de carregado não custa nada. O único instrumento de rotatividade que resta é a </w:t>
       </w:r>
       <w:r>
-        <w:t>como a energia é limitada pela carga que faltava (RN-03), ocupar a vaga depois de carregado não custa nada. O único instrumento de rotatividade que resta é a duração máxima e a sinalização no painel, e não o preço. Ver RI-04.</w:t>
+        <w:t>duração máxima e a sinalização no painel, e não o preço. Ver RI-04.</w:t>
       </w:r>
     </w:p>
     <w:p>
@@ -2442,7 +2506,10 @@
         <w:t>Performance</w:t>
       </w:r>
       <w:r>
-        <w:t xml:space="preserve">), Suportabilidade e, no "+", requisitos de design, de implementação, de interface e físicos. As restrições de prazo, equipe e processo não pertencem a nenhuma dessas categorias e aparecem como </w:t>
+        <w:t xml:space="preserve">), Suportabilidade e, no "+", requisitos de design, de implementação, de </w:t>
+      </w:r>
+      <w:r>
+        <w:t xml:space="preserve">interface e físicos. As restrições de prazo, equipe e processo não pertencem a nenhuma dessas categorias e aparecem como </w:t>
       </w:r>
       <w:r>
         <w:rPr>
@@ -2461,6 +2528,7 @@
       </w:pPr>
       <w:bookmarkStart w:id="9" w:name="X37ec1812b6275dda13445dfc3fff1b449997757"/>
       <w:r>
+        <w:lastRenderedPageBreak/>
         <w:t>Restrições de tecnologia e implementação</w:t>
       </w:r>
     </w:p>
@@ -3636,6 +3704,7 @@
       <w:bookmarkStart w:id="12" w:name="X49d3a7fd1a61bf7e8b653313dc8161a487b4729"/>
       <w:bookmarkEnd w:id="11"/>
       <w:r>
+        <w:lastRenderedPageBreak/>
         <w:t>Requisitos não funcionais além das restrições</w:t>
       </w:r>
     </w:p>
@@ -4587,7 +4656,11 @@
               <w:t xml:space="preserve"> </w:t>
             </w:r>
             <w:r>
-              <w:t>O sistema sinaliza as sessões abertas além do tempo previsto, e o síndico as encerra administrativamente. A energia é limitada pela carga que faltava, o que impede a apuração de crescer indefinidamente.</w:t>
+              <w:t xml:space="preserve">O sistema sinaliza as sessões abertas além do tempo previsto, e o síndico as encerra administrativamente. A energia é limitada pela carga que faltava, o que impede a apuração de crescer </w:t>
+            </w:r>
+            <w:r>
+              <w:lastRenderedPageBreak/>
+              <w:t>indefinidamente.</w:t>
             </w:r>
           </w:p>
         </w:tc>
@@ -4606,6 +4679,7 @@
               <w:jc w:val="left"/>
             </w:pPr>
             <w:r>
+              <w:lastRenderedPageBreak/>
               <w:t>RI-04</w:t>
             </w:r>
           </w:p>
@@ -4957,7 +5031,7 @@
               <w:jc w:val="left"/>
             </w:pPr>
             <w:r>
-              <w:t>Retrabalho na Elaboração; atraso na definição da arquitetura.</w:t>
+              <w:t>Retrabalho na Construção; atraso nas entregas de sessão e de rateio.</w:t>
             </w:r>
           </w:p>
         </w:tc>
@@ -4978,7 +5052,7 @@
               <w:t>Mitigar.</w:t>
             </w:r>
             <w:r>
-              <w:t xml:space="preserve"> Previsão de conclusão e apuração são atacadas primeiro na Elaboração, como arquitetura executável, por concentrarem o maior risco técnico do projeto.</w:t>
+              <w:t xml:space="preserve"> A arquitetura é testada com o UC05 (Manter Veículo) na Elaboração. Previsão de conclusão e apuração entram no sprint 5, o primeiro da Construção, isoladas num serviço coberto por testes de unidade, por concentrarem o maior risco técnico do projeto.</w:t>
             </w:r>
           </w:p>
         </w:tc>
@@ -5368,7 +5442,11 @@
               <w:t>ajuda contextual nas próprias telas</w:t>
             </w:r>
             <w:r>
-              <w:t>, dado que o morador o acessa pelo celular e sem treinamento prévio.</w:t>
+              <w:t xml:space="preserve">, dado que o morador o acessa pelo </w:t>
+            </w:r>
+            <w:r>
+              <w:lastRenderedPageBreak/>
+              <w:t>celular e sem treinamento prévio.</w:t>
             </w:r>
           </w:p>
         </w:tc>
@@ -5387,6 +5465,7 @@
               <w:jc w:val="left"/>
             </w:pPr>
             <w:r>
+              <w:lastRenderedPageBreak/>
               <w:t>Manual do Usuário - Síndico</w:t>
             </w:r>
           </w:p>
@@ -5752,7 +5831,7 @@
             <w:rPr>
               <w:b/>
             </w:rPr>
-            <w:pict w14:anchorId="56536767">
+            <w:pict w14:anchorId="0F67FDB0">
               <v:shapetype id="_x0000_t75" coordsize="21600,21600" o:spt="75" o:preferrelative="t" path="m@4@5l@4@11@9@11@9@5xe" filled="f" stroked="f">
                 <v:stroke joinstyle="miter"/>
                 <v:formulas>
@@ -5794,7 +5873,7 @@
   <w:abstractNum w:abstractNumId="0" w15:restartNumberingAfterBreak="0">
     <w:nsid w:val="0000A990"/>
     <w:multiLevelType w:val="multilevel"/>
-    <w:tmpl w:val="0448BD40"/>
+    <w:tmpl w:val="0584051A"/>
     <w:lvl w:ilvl="0">
       <w:numFmt w:val="bullet"/>
       <w:lvlText w:val=" "/>
@@ -6660,37 +6739,37 @@
       </w:rPr>
     </w:lvl>
   </w:abstractNum>
-  <w:num w:numId="1" w16cid:durableId="1123622287">
+  <w:num w:numId="1" w16cid:durableId="1045253923">
     <w:abstractNumId w:val="5"/>
   </w:num>
-  <w:num w:numId="2" w16cid:durableId="1220360555">
+  <w:num w:numId="2" w16cid:durableId="933586426">
     <w:abstractNumId w:val="7"/>
   </w:num>
-  <w:num w:numId="3" w16cid:durableId="1583641361">
+  <w:num w:numId="3" w16cid:durableId="314915498">
     <w:abstractNumId w:val="7"/>
   </w:num>
-  <w:num w:numId="4" w16cid:durableId="708190037">
+  <w:num w:numId="4" w16cid:durableId="273831187">
     <w:abstractNumId w:val="7"/>
   </w:num>
-  <w:num w:numId="5" w16cid:durableId="403451187">
+  <w:num w:numId="5" w16cid:durableId="1100376582">
     <w:abstractNumId w:val="7"/>
   </w:num>
-  <w:num w:numId="6" w16cid:durableId="1316452367">
+  <w:num w:numId="6" w16cid:durableId="1221551868">
     <w:abstractNumId w:val="2"/>
   </w:num>
-  <w:num w:numId="7" w16cid:durableId="949314738">
+  <w:num w:numId="7" w16cid:durableId="1373730256">
     <w:abstractNumId w:val="1"/>
   </w:num>
-  <w:num w:numId="8" w16cid:durableId="2087992774">
+  <w:num w:numId="8" w16cid:durableId="1611744015">
     <w:abstractNumId w:val="3"/>
   </w:num>
-  <w:num w:numId="9" w16cid:durableId="359744804">
+  <w:num w:numId="9" w16cid:durableId="278488364">
     <w:abstractNumId w:val="6"/>
   </w:num>
-  <w:num w:numId="10" w16cid:durableId="553614253">
+  <w:num w:numId="10" w16cid:durableId="356127853">
     <w:abstractNumId w:val="4"/>
   </w:num>
-  <w:num w:numId="11" w16cid:durableId="1535801756">
+  <w:num w:numId="11" w16cid:durableId="800196324">
     <w:abstractNumId w:val="0"/>
   </w:num>
 </w:numbering>

</xml_diff>

<commit_message>
Define a vigência da tarifa como a data e hora do cadastro até a próxima
A tarifa vale do cadastro até o cadastro da próxima, sem data informada
pelo síndico. Reajuste no meio do mês vale para as sessões iniciadas
depois dele; a sessão em andamento segue a tarifa do início.

- Documento de Requisitos v1.2: RF-13, RN-08 e nova RN-10
- História de Usuário v4.1: testes de aceitação da HU-08
- UC08 e Tarifa no Astah
</commit_message>
<xml_diff>
--- a/1.Requisitos/CARREGAJA - Documento de Requisitos.docx
+++ b/1.Requisitos/CARREGAJA - Documento de Requisitos.docx
@@ -15,7 +15,7 @@
         <w:pStyle w:val="Titulodocumento"/>
       </w:pPr>
       <w:r>
-        <w:t>Versão 1.1</w:t>
+        <w:t>Versão 1.2</w:t>
       </w:r>
     </w:p>
     <w:p>
@@ -265,6 +265,67 @@
           </w:p>
         </w:tc>
       </w:tr>
+      <w:tr>
+        <w:trPr>
+          <w:cantSplit/>
+        </w:trPr>
+        <w:tc>
+          <w:tcPr>
+            <w:tcW w:w="618" w:type="pct"/>
+          </w:tcPr>
+          <w:p>
+            <w:pPr>
+              <w:spacing w:after="40"/>
+              <w:jc w:val="left"/>
+            </w:pPr>
+            <w:r>
+              <w:t>11/10/2026</w:t>
+            </w:r>
+          </w:p>
+        </w:tc>
+        <w:tc>
+          <w:tcPr>
+            <w:tcW w:w="449" w:type="pct"/>
+          </w:tcPr>
+          <w:p>
+            <w:pPr>
+              <w:spacing w:after="40"/>
+              <w:jc w:val="left"/>
+            </w:pPr>
+            <w:r>
+              <w:t>1.2</w:t>
+            </w:r>
+          </w:p>
+        </w:tc>
+        <w:tc>
+          <w:tcPr>
+            <w:tcW w:w="2997" w:type="pct"/>
+          </w:tcPr>
+          <w:p>
+            <w:pPr>
+              <w:spacing w:after="40"/>
+              <w:jc w:val="left"/>
+            </w:pPr>
+            <w:r>
+              <w:t>RF-13 e RN-08: a tarifa vale a partir da data e hora do cadastro, até o cadastro da próxima, sem data informada pelo síndico. Nova RN-10.</w:t>
+            </w:r>
+          </w:p>
+        </w:tc>
+        <w:tc>
+          <w:tcPr>
+            <w:tcW w:w="937" w:type="pct"/>
+          </w:tcPr>
+          <w:p>
+            <w:pPr>
+              <w:spacing w:after="40"/>
+              <w:jc w:val="left"/>
+            </w:pPr>
+            <w:r>
+              <w:t>Henrique de Almeida Marangoni Inacio</w:t>
+            </w:r>
+          </w:p>
+        </w:tc>
+      </w:tr>
     </w:tbl>
     <w:p>
       <w:pPr>
@@ -286,7 +347,10 @@
     </w:p>
     <w:p>
       <w:r>
-        <w:t>O Visão dá a visão geral do CARREGAJA: o problema, os usuários, as restrições e os riscos. Este documento detalha o que o Visão resume: os requisitos funcionais, as regras de negócio, a justificativa de cada restrição, as limitações que o projeto aceita conscientemente e a análise completa dos riscos.</w:t>
+        <w:t xml:space="preserve">O Visão dá a visão geral do CARREGAJA: o problema, os usuários, as restrições e os riscos. Este </w:t>
+      </w:r>
+      <w:r>
+        <w:t>documento detalha o que o Visão resume: os requisitos funcionais, as regras de negócio, a justificativa de cada restrição, as limitações que o projeto aceita conscientemente e a análise completa dos riscos.</w:t>
       </w:r>
     </w:p>
     <w:p>
@@ -561,7 +625,10 @@
     </w:p>
     <w:p>
       <w:r>
-        <w:t>Condomínios residenciais verticais vêm instalando pontos de recarga para veículos elétricos nas áreas comuns da garagem. O número de pontos é pequeno, tipicamente de um a quatro, e é compartilhado por dezenas de apartamentos. A energia consumida sai da conta de luz da área comum, paga por todos os condôminos, inclusive por quem não possui veículo elétrico.</w:t>
+        <w:t xml:space="preserve">Condomínios residenciais verticais vêm instalando pontos de recarga para veículos elétricos nas áreas comuns da garagem. O número de pontos é pequeno, tipicamente de um a quatro, e é compartilhado por dezenas de apartamentos. A energia consumida sai da conta de luz da área </w:t>
+      </w:r>
+      <w:r>
+        <w:t>comum, paga por todos os condôminos, inclusive por quem não possui veículo elétrico.</w:t>
       </w:r>
     </w:p>
     <w:p>
@@ -579,10 +646,11 @@
         <w:t>disputa pelo recurso</w:t>
       </w:r>
       <w:r>
-        <w:t xml:space="preserve">: o morador </w:t>
+        <w:t xml:space="preserve">: o morador desce à garagem sem saber se encontrará ponto livre e, quando encontra tudo ocupado, não tem como saber </w:t>
       </w:r>
       <w:r>
-        <w:t xml:space="preserve">desce à garagem sem saber se encontrará ponto livre e, quando encontra tudo ocupado, não tem como saber quando algum será liberado. O segundo é de </w:t>
+        <w:lastRenderedPageBreak/>
+        <w:t xml:space="preserve">quando algum será liberado. O segundo é de </w:t>
       </w:r>
       <w:r>
         <w:rPr>
@@ -592,11 +660,10 @@
         <w:t>rateio</w:t>
       </w:r>
       <w:r>
-        <w:t xml:space="preserve">: sem registro de quem usou, por quanto tempo e com qual veículo, o condomínio não individualiza o custo, e a energia de poucos acaba dividida entre todos. Os </w:t>
+        <w:t xml:space="preserve">: sem registro de quem usou, por quanto tempo e com qual veículo, o condomínio não individualiza o custo, e a energia de poucos </w:t>
       </w:r>
       <w:r>
-        <w:lastRenderedPageBreak/>
-        <w:t>controles paralelos hoje usados (grupo de mensagens, planilha do síndico, rodízio informal) não produzem número defensável para lançar na cota condominial.</w:t>
+        <w:t>acaba dividida entre todos. Os controles paralelos hoje usados (grupo de mensagens, planilha do síndico, rodízio informal) não produzem número defensável para lançar na cota condominial.</w:t>
       </w:r>
     </w:p>
     <w:p>
@@ -611,10 +678,10 @@
         <w:t>Origem dos requisitos.</w:t>
       </w:r>
       <w:r>
-        <w:t xml:space="preserve"> </w:t>
+        <w:t xml:space="preserve"> O projeto é conduzido em contexto acadêmico e não dispõe de cliente externo contratante. As necessidades foram levantadas pela equipe a partir da análise do domínio, e o Product Owner atua como representante do cliente para aprovação do escopo e do </w:t>
       </w:r>
       <w:r>
-        <w:t>O projeto é conduzido em contexto acadêmico e não dispõe de cliente externo contratante. As necessidades foram levantadas pela equipe a partir da análise do domínio, e o Product Owner atua como representante do cliente para aprovação do escopo e do planejamento, conforme previsto no SpinOff para o papel (RE-16).</w:t>
+        <w:t>planejamento, conforme previsto no SpinOff para o papel (RE-16).</w:t>
       </w:r>
     </w:p>
     <w:p>
@@ -851,7 +918,10 @@
         <w:t>Acumulação de perfis.</w:t>
       </w:r>
       <w:r>
-        <w:t xml:space="preserve"> O síndico é também condômino e pode possuir veículo elétrico. Nesse caso acumula os dois perfis: usa o sistema como morador para as próprias recargas, apuradas e rateadas como as demais, e como síndico para a gestão. As ações de gestão ficam registradas com o usuário que as realizou.</w:t>
+        <w:t xml:space="preserve"> O síndico é também condômino e pode possuir veículo elétrico. Nesse caso acumula os dois perfis: usa o sistema como morador para as próprias recargas, apuradas e </w:t>
+      </w:r>
+      <w:r>
+        <w:t>rateadas como as demais, e como síndico para a gestão. As ações de gestão ficam registradas com o usuário que as realizou.</w:t>
       </w:r>
     </w:p>
     <w:p>
@@ -1543,7 +1613,7 @@
               <w:jc w:val="left"/>
             </w:pPr>
             <w:r>
-              <w:t>Permitir ao síndico definir a tarifa do kWh com início de vigência, preservando as anteriores.</w:t>
+              <w:t>Permitir ao síndico cadastrar a tarifa do kWh, que vale da data e hora do cadastro até o cadastro da próxima (RN-10), preservando as anteriores.</w:t>
             </w:r>
           </w:p>
         </w:tc>
@@ -1717,11 +1787,8 @@
               <w:jc w:val="left"/>
             </w:pPr>
             <w:r>
-              <w:t>RF-</w:t>
-            </w:r>
-            <w:r>
               <w:lastRenderedPageBreak/>
-              <w:t>17</w:t>
+              <w:t>RF-17</w:t>
             </w:r>
           </w:p>
         </w:tc>
@@ -1735,12 +1802,7 @@
               <w:jc w:val="left"/>
             </w:pPr>
             <w:r>
-              <w:lastRenderedPageBreak/>
-              <w:t xml:space="preserve">Exibir o histórico de utilização por vaga, apartamento e período, com as tentativas </w:t>
-            </w:r>
-            <w:r>
-              <w:lastRenderedPageBreak/>
-              <w:t>recusadas por falta de vaga.</w:t>
+              <w:t>Exibir o histórico de utilização por vaga, apartamento e período, com as tentativas recusadas por falta de vaga.</w:t>
             </w:r>
           </w:p>
         </w:tc>
@@ -1754,7 +1816,6 @@
               <w:jc w:val="left"/>
             </w:pPr>
             <w:r>
-              <w:lastRenderedPageBreak/>
               <w:t>UC12</w:t>
             </w:r>
           </w:p>
@@ -2127,10 +2188,7 @@
               <w:t>Potência efetiva</w:t>
             </w:r>
             <w:r>
-              <w:t xml:space="preserve"> </w:t>
-            </w:r>
-            <w:r>
-              <w:t>= min(potência do carregador, potência máxima do veículo). Um carregador de 22 kW não recarrega mais rápido um veículo que aceita no máximo 6,6 kW.</w:t>
+              <w:t xml:space="preserve"> = min(potência do carregador, potência máxima do veículo). Um carregador de 22 kW não recarrega mais rápido um veículo que aceita no máximo 6,6 kW.</w:t>
             </w:r>
           </w:p>
         </w:tc>
@@ -2395,7 +2453,7 @@
               <w:jc w:val="left"/>
             </w:pPr>
             <w:r>
-              <w:t>O mês só pode ser fechado sem sessões abertas no período. Depois de fechado, não aceita sessões, alterações nem tarifa retroativa.</w:t>
+              <w:t>O mês só pode ser fechado sem sessões abertas no período. Depois de fechado, não aceita sessões nem alterações no período.</w:t>
             </w:r>
           </w:p>
         </w:tc>
@@ -2429,6 +2487,39 @@
             </w:pPr>
             <w:r>
               <w:t>Vaga ou morador com histórico é desativado, e não removido.</w:t>
+            </w:r>
+          </w:p>
+        </w:tc>
+      </w:tr>
+      <w:tr>
+        <w:trPr>
+          <w:cantSplit/>
+        </w:trPr>
+        <w:tc>
+          <w:tcPr>
+            <w:tcW w:w="487" w:type="pct"/>
+          </w:tcPr>
+          <w:p>
+            <w:pPr>
+              <w:spacing w:after="40"/>
+              <w:jc w:val="left"/>
+            </w:pPr>
+            <w:r>
+              <w:t>RN-10</w:t>
+            </w:r>
+          </w:p>
+        </w:tc>
+        <w:tc>
+          <w:tcPr>
+            <w:tcW w:w="4513" w:type="pct"/>
+          </w:tcPr>
+          <w:p>
+            <w:pPr>
+              <w:spacing w:after="40"/>
+              <w:jc w:val="left"/>
+            </w:pPr>
+            <w:r>
+              <w:t>A tarifa vale da data e hora em que foi cadastrada até o cadastro da próxima. O síndico não informa a data: não há tarifa retroativa nem antecipada. Um reajuste no meio do mês vale só para as sessões iniciadas depois dele (RN-03, RN-04).</w:t>
             </w:r>
           </w:p>
         </w:tc>
@@ -2443,10 +2534,10 @@
         <w:t>Por que a apuração é por energia, e não por tempo.</w:t>
       </w:r>
       <w:r>
-        <w:t xml:space="preserve"> Na versão 1.1 do Visão, com motorista </w:t>
+        <w:t xml:space="preserve"> Na versão 1.1 do Visão, com motorista anônimo, cobrar por tempo evitava que se subdeclarasse a potência para pagar menos. Aqui o </w:t>
       </w:r>
       <w:r>
-        <w:t>anônimo, cobrar por tempo evitava que se subdeclarasse a potência para pagar menos. Aqui o morador é identificado, recorrente, e cadastra o veículo uma única vez, sob vista do síndico. A brecha fecha, e a energia passa a ser a unidade certa: é em kWh que a concessionária cobra o condomínio, e é isso que o rateio devolve.</w:t>
+        <w:t>morador é identificado, recorrente, e cadastra o veículo uma única vez, sob vista do síndico. A brecha fecha, e a energia passa a ser a unidade certa: é em kWh que a concessionária cobra o condomínio, e é isso que o rateio devolve.</w:t>
       </w:r>
     </w:p>
     <w:p>
@@ -2458,10 +2549,7 @@
         <w:t>Consequência aceita:</w:t>
       </w:r>
       <w:r>
-        <w:t xml:space="preserve"> como a energia é limitada pela carga que faltava (RN-03), ocupar a vaga depois de carregado não custa nada. O único instrumento de rotatividade que resta é a </w:t>
-      </w:r>
-      <w:r>
-        <w:t>duração máxima e a sinalização no painel, e não o preço. Ver RI-04.</w:t>
+        <w:t xml:space="preserve"> como a energia é limitada pela carga que faltava (RN-03), ocupar a vaga depois de carregado não custa nada. O único instrumento de rotatividade que resta é a duração máxima e a sinalização no painel, e não o preço. Ver RI-04.</w:t>
       </w:r>
     </w:p>
     <w:p>
@@ -2506,10 +2594,11 @@
         <w:t>Performance</w:t>
       </w:r>
       <w:r>
-        <w:t xml:space="preserve">), Suportabilidade e, no "+", requisitos de design, de implementação, de </w:t>
+        <w:t xml:space="preserve">), Suportabilidade e, no "+", requisitos </w:t>
       </w:r>
       <w:r>
-        <w:t xml:space="preserve">interface e físicos. As restrições de prazo, equipe e processo não pertencem a nenhuma dessas categorias e aparecem como </w:t>
+        <w:lastRenderedPageBreak/>
+        <w:t xml:space="preserve">de design, de implementação, de interface e físicos. As restrições de prazo, equipe e processo não pertencem a nenhuma dessas categorias e aparecem como </w:t>
       </w:r>
       <w:r>
         <w:rPr>
@@ -2528,7 +2617,6 @@
       </w:pPr>
       <w:bookmarkStart w:id="9" w:name="X37ec1812b6275dda13445dfc3fff1b449997757"/>
       <w:r>
-        <w:lastRenderedPageBreak/>
         <w:t>Restrições de tecnologia e implementação</w:t>
       </w:r>
     </w:p>
@@ -2940,10 +3028,64 @@
               <w:t>O sistema não se integra ao hardware dos carregadores.</w:t>
             </w:r>
             <w:r>
+              <w:t xml:space="preserve"> O estado das vagas, o início e o fim das sessões são determinados exclusivamente pelo que os moradores registram. O sistema não aciona, não bloqueia e não mede o equipamento. Ver seção 7.</w:t>
+            </w:r>
+          </w:p>
+        </w:tc>
+        <w:tc>
+          <w:tcPr>
+            <w:tcW w:w="768" w:type="pct"/>
+          </w:tcPr>
+          <w:p>
+            <w:pPr>
+              <w:spacing w:after="40"/>
+              <w:jc w:val="left"/>
+            </w:pPr>
+            <w:r>
+              <w:t>Interface</w:t>
+            </w:r>
+          </w:p>
+        </w:tc>
+      </w:tr>
+      <w:tr>
+        <w:trPr>
+          <w:cantSplit/>
+        </w:trPr>
+        <w:tc>
+          <w:tcPr>
+            <w:tcW w:w="487" w:type="pct"/>
+          </w:tcPr>
+          <w:p>
+            <w:pPr>
+              <w:spacing w:after="40"/>
+              <w:jc w:val="left"/>
+            </w:pPr>
+            <w:r>
+              <w:t>RE-06</w:t>
+            </w:r>
+          </w:p>
+        </w:tc>
+        <w:tc>
+          <w:tcPr>
+            <w:tcW w:w="3745" w:type="pct"/>
+          </w:tcPr>
+          <w:p>
+            <w:pPr>
+              <w:spacing w:after="40"/>
+              <w:jc w:val="left"/>
+            </w:pPr>
+            <w:r>
+              <w:rPr>
+                <w:b/>
+                <w:bCs/>
+              </w:rPr>
+              <w:t>O sistema não processa pagamento e não emite cobrança.</w:t>
+            </w:r>
+            <w:r>
               <w:t xml:space="preserve"> </w:t>
             </w:r>
             <w:r>
-              <w:t>O estado das vagas, o início e o fim das sessões são determinados exclusivamente pelo que os moradores registram. O sistema não aciona, não bloqueia e não mede o equipamento. Ver seção 7.</w:t>
+              <w:t>Apura o consumo e o valor por apartamento no período e os disponibiliza ao síndico, que os repassa à administradora para lançamento na cota condominial.</w:t>
             </w:r>
           </w:p>
         </w:tc>
@@ -2957,6 +3099,228 @@
               <w:jc w:val="left"/>
             </w:pPr>
             <w:r>
+              <w:t>Funcionalidade</w:t>
+            </w:r>
+          </w:p>
+        </w:tc>
+      </w:tr>
+      <w:tr>
+        <w:trPr>
+          <w:cantSplit/>
+        </w:trPr>
+        <w:tc>
+          <w:tcPr>
+            <w:tcW w:w="487" w:type="pct"/>
+          </w:tcPr>
+          <w:p>
+            <w:pPr>
+              <w:spacing w:after="40"/>
+              <w:jc w:val="left"/>
+            </w:pPr>
+            <w:r>
+              <w:t>RE-07</w:t>
+            </w:r>
+          </w:p>
+        </w:tc>
+        <w:tc>
+          <w:tcPr>
+            <w:tcW w:w="3745" w:type="pct"/>
+          </w:tcPr>
+          <w:p>
+            <w:pPr>
+              <w:spacing w:after="40"/>
+              <w:jc w:val="left"/>
+            </w:pPr>
+            <w:r>
+              <w:rPr>
+                <w:b/>
+                <w:bCs/>
+              </w:rPr>
+              <w:t>O sistema atende a um único condomínio.</w:t>
+            </w:r>
+            <w:r>
+              <w:t xml:space="preserve"> Não há multiempresa, gestão de assinantes nem separação de dados por cliente contratante. Instalação em outro condomínio é nova implantação, com base própria.</w:t>
+            </w:r>
+          </w:p>
+        </w:tc>
+        <w:tc>
+          <w:tcPr>
+            <w:tcW w:w="768" w:type="pct"/>
+          </w:tcPr>
+          <w:p>
+            <w:pPr>
+              <w:spacing w:after="40"/>
+              <w:jc w:val="left"/>
+            </w:pPr>
+            <w:r>
+              <w:t>Funcionalidade</w:t>
+            </w:r>
+          </w:p>
+        </w:tc>
+      </w:tr>
+      <w:tr>
+        <w:trPr>
+          <w:cantSplit/>
+        </w:trPr>
+        <w:tc>
+          <w:tcPr>
+            <w:tcW w:w="487" w:type="pct"/>
+          </w:tcPr>
+          <w:p>
+            <w:pPr>
+              <w:spacing w:after="40"/>
+              <w:jc w:val="left"/>
+            </w:pPr>
+            <w:r>
+              <w:t>RE-08</w:t>
+            </w:r>
+          </w:p>
+        </w:tc>
+        <w:tc>
+          <w:tcPr>
+            <w:tcW w:w="3745" w:type="pct"/>
+          </w:tcPr>
+          <w:p>
+            <w:pPr>
+              <w:spacing w:after="40"/>
+              <w:jc w:val="left"/>
+            </w:pPr>
+            <w:r>
+              <w:rPr>
+                <w:b/>
+                <w:bCs/>
+              </w:rPr>
+              <w:t>O morador possui cadastro e credenciais.</w:t>
+            </w:r>
+            <w:r>
+              <w:t xml:space="preserve"> </w:t>
+            </w:r>
+            <w:r>
+              <w:t>Todo uso é identificado e vinculado a um apartamento; não há uso anônimo. O cadastro de moradores é mantido pelo síndico.</w:t>
+            </w:r>
+          </w:p>
+        </w:tc>
+        <w:tc>
+          <w:tcPr>
+            <w:tcW w:w="768" w:type="pct"/>
+          </w:tcPr>
+          <w:p>
+            <w:pPr>
+              <w:spacing w:after="40"/>
+              <w:jc w:val="left"/>
+            </w:pPr>
+            <w:r>
+              <w:t>Funcionalidade</w:t>
+            </w:r>
+          </w:p>
+        </w:tc>
+      </w:tr>
+      <w:tr>
+        <w:trPr>
+          <w:cantSplit/>
+        </w:trPr>
+        <w:tc>
+          <w:tcPr>
+            <w:tcW w:w="487" w:type="pct"/>
+          </w:tcPr>
+          <w:p>
+            <w:pPr>
+              <w:spacing w:after="40"/>
+              <w:jc w:val="left"/>
+            </w:pPr>
+            <w:r>
+              <w:t>RE-09</w:t>
+            </w:r>
+          </w:p>
+        </w:tc>
+        <w:tc>
+          <w:tcPr>
+            <w:tcW w:w="3745" w:type="pct"/>
+          </w:tcPr>
+          <w:p>
+            <w:pPr>
+              <w:spacing w:after="40"/>
+              <w:jc w:val="left"/>
+            </w:pPr>
+            <w:r>
+              <w:t xml:space="preserve">A energia atribuída a cada sessão é </w:t>
+            </w:r>
+            <w:r>
+              <w:rPr>
+                <w:b/>
+                <w:bCs/>
+              </w:rPr>
+              <w:t>estimada</w:t>
+            </w:r>
+            <w:r>
+              <w:t xml:space="preserve"> a partir da potência efetiva e da duração, e não medida, uma vez que não há medição no carregador. Ver seção 7.</w:t>
+            </w:r>
+          </w:p>
+        </w:tc>
+        <w:tc>
+          <w:tcPr>
+            <w:tcW w:w="768" w:type="pct"/>
+          </w:tcPr>
+          <w:p>
+            <w:pPr>
+              <w:spacing w:after="40"/>
+              <w:jc w:val="left"/>
+            </w:pPr>
+            <w:r>
+              <w:t>Confiabilidade</w:t>
+            </w:r>
+          </w:p>
+        </w:tc>
+      </w:tr>
+      <w:tr>
+        <w:trPr>
+          <w:cantSplit/>
+        </w:trPr>
+        <w:tc>
+          <w:tcPr>
+            <w:tcW w:w="487" w:type="pct"/>
+          </w:tcPr>
+          <w:p>
+            <w:pPr>
+              <w:spacing w:after="40"/>
+              <w:jc w:val="left"/>
+            </w:pPr>
+            <w:r>
+              <w:t>RE-10</w:t>
+            </w:r>
+          </w:p>
+        </w:tc>
+        <w:tc>
+          <w:tcPr>
+            <w:tcW w:w="3745" w:type="pct"/>
+          </w:tcPr>
+          <w:p>
+            <w:pPr>
+              <w:spacing w:after="40"/>
+              <w:jc w:val="left"/>
+            </w:pPr>
+            <w:r>
+              <w:rPr>
+                <w:b/>
+                <w:bCs/>
+              </w:rPr>
+              <w:t>O sistema não se integra ao sistema da administradora do condomínio.</w:t>
+            </w:r>
+            <w:r>
+              <w:t xml:space="preserve"> O resultado do fechamento é obtido em tela e exportável, e o lançamento na cota é feito fora do sistema.</w:t>
+            </w:r>
+          </w:p>
+        </w:tc>
+        <w:tc>
+          <w:tcPr>
+            <w:tcW w:w="768" w:type="pct"/>
+          </w:tcPr>
+          <w:p>
+            <w:pPr>
+              <w:spacing w:after="40"/>
+              <w:jc w:val="left"/>
+            </w:pPr>
+            <w:r>
               <w:t>Interface</w:t>
             </w:r>
           </w:p>
@@ -2976,7 +3340,7 @@
               <w:jc w:val="left"/>
             </w:pPr>
             <w:r>
-              <w:t>RE-06</w:t>
+              <w:t>RE-11</w:t>
             </w:r>
           </w:p>
         </w:tc>
@@ -2994,10 +3358,30 @@
                 <w:b/>
                 <w:bCs/>
               </w:rPr>
-              <w:t>O sistema não processa pagamento e não emite cobrança.</w:t>
-            </w:r>
-            <w:r>
-              <w:t xml:space="preserve"> Apura o consumo e o valor por apartamento no período e os disponibiliza ao síndico, que os repassa à administradora para lançamento na cota condominial.</w:t>
+              <w:t>A duração máxima de uma sessão de recarga é de 6 horas.</w:t>
+            </w:r>
+            <w:r>
+              <w:t xml:space="preserve"> Atingido o limite, o sistema </w:t>
+            </w:r>
+            <w:r>
+              <w:rPr>
+                <w:b/>
+                <w:bCs/>
+              </w:rPr>
+              <w:t>sinaliza a sessão como excedida</w:t>
+            </w:r>
+            <w:r>
+              <w:t xml:space="preserve"> no painel e a mantém aberta, </w:t>
+            </w:r>
+            <w:r>
+              <w:rPr>
+                <w:b/>
+                <w:bCs/>
+              </w:rPr>
+              <w:t>sem encerrá-la automaticamente</w:t>
+            </w:r>
+            <w:r>
+              <w:t>. O encerramento continua sendo do morador ou, na sua ausência, do síndico pela via administrativa.</w:t>
             </w:r>
           </w:p>
         </w:tc>
@@ -3030,7 +3414,7 @@
               <w:jc w:val="left"/>
             </w:pPr>
             <w:r>
-              <w:t>RE-07</w:t>
+              <w:t>RE-12</w:t>
             </w:r>
           </w:p>
         </w:tc>
@@ -3048,309 +3432,13 @@
                 <w:b/>
                 <w:bCs/>
               </w:rPr>
-              <w:t>O sistema atende a um único condomínio.</w:t>
+              <w:t>Não há agendamento nem reserva de vagas.</w:t>
             </w:r>
             <w:r>
               <w:t xml:space="preserve"> </w:t>
             </w:r>
             <w:r>
-              <w:t>Não há multiempresa, gestão de assinantes nem separação de dados por cliente contratante. Instalação em outro condomínio é nova implantação, com base própria.</w:t>
-            </w:r>
-          </w:p>
-        </w:tc>
-        <w:tc>
-          <w:tcPr>
-            <w:tcW w:w="768" w:type="pct"/>
-          </w:tcPr>
-          <w:p>
-            <w:pPr>
-              <w:spacing w:after="40"/>
-              <w:jc w:val="left"/>
-            </w:pPr>
-            <w:r>
-              <w:t>Funcionalidade</w:t>
-            </w:r>
-          </w:p>
-        </w:tc>
-      </w:tr>
-      <w:tr>
-        <w:trPr>
-          <w:cantSplit/>
-        </w:trPr>
-        <w:tc>
-          <w:tcPr>
-            <w:tcW w:w="487" w:type="pct"/>
-          </w:tcPr>
-          <w:p>
-            <w:pPr>
-              <w:spacing w:after="40"/>
-              <w:jc w:val="left"/>
-            </w:pPr>
-            <w:r>
-              <w:t>RE-08</w:t>
-            </w:r>
-          </w:p>
-        </w:tc>
-        <w:tc>
-          <w:tcPr>
-            <w:tcW w:w="3745" w:type="pct"/>
-          </w:tcPr>
-          <w:p>
-            <w:pPr>
-              <w:spacing w:after="40"/>
-              <w:jc w:val="left"/>
-            </w:pPr>
-            <w:r>
-              <w:rPr>
-                <w:b/>
-                <w:bCs/>
-              </w:rPr>
-              <w:t>O morador possui cadastro e credenciais.</w:t>
-            </w:r>
-            <w:r>
-              <w:t xml:space="preserve"> Todo uso é identificado e vinculado a um apartamento; não há uso anônimo. O cadastro de moradores é mantido pelo síndico.</w:t>
-            </w:r>
-          </w:p>
-        </w:tc>
-        <w:tc>
-          <w:tcPr>
-            <w:tcW w:w="768" w:type="pct"/>
-          </w:tcPr>
-          <w:p>
-            <w:pPr>
-              <w:spacing w:after="40"/>
-              <w:jc w:val="left"/>
-            </w:pPr>
-            <w:r>
-              <w:t>Funcionalidade</w:t>
-            </w:r>
-          </w:p>
-        </w:tc>
-      </w:tr>
-      <w:tr>
-        <w:trPr>
-          <w:cantSplit/>
-        </w:trPr>
-        <w:tc>
-          <w:tcPr>
-            <w:tcW w:w="487" w:type="pct"/>
-          </w:tcPr>
-          <w:p>
-            <w:pPr>
-              <w:spacing w:after="40"/>
-              <w:jc w:val="left"/>
-            </w:pPr>
-            <w:r>
-              <w:t>RE-09</w:t>
-            </w:r>
-          </w:p>
-        </w:tc>
-        <w:tc>
-          <w:tcPr>
-            <w:tcW w:w="3745" w:type="pct"/>
-          </w:tcPr>
-          <w:p>
-            <w:pPr>
-              <w:spacing w:after="40"/>
-              <w:jc w:val="left"/>
-            </w:pPr>
-            <w:r>
-              <w:t xml:space="preserve">A energia atribuída a cada sessão é </w:t>
-            </w:r>
-            <w:r>
-              <w:rPr>
-                <w:b/>
-                <w:bCs/>
-              </w:rPr>
-              <w:t>estimada</w:t>
-            </w:r>
-            <w:r>
-              <w:t xml:space="preserve"> </w:t>
-            </w:r>
-            <w:r>
-              <w:t>a partir da potência efetiva e da duração, e não medida, uma vez que não há medição no carregador. Ver seção 7.</w:t>
-            </w:r>
-          </w:p>
-        </w:tc>
-        <w:tc>
-          <w:tcPr>
-            <w:tcW w:w="768" w:type="pct"/>
-          </w:tcPr>
-          <w:p>
-            <w:pPr>
-              <w:spacing w:after="40"/>
-              <w:jc w:val="left"/>
-            </w:pPr>
-            <w:r>
-              <w:t>Confiabilidade</w:t>
-            </w:r>
-          </w:p>
-        </w:tc>
-      </w:tr>
-      <w:tr>
-        <w:trPr>
-          <w:cantSplit/>
-        </w:trPr>
-        <w:tc>
-          <w:tcPr>
-            <w:tcW w:w="487" w:type="pct"/>
-          </w:tcPr>
-          <w:p>
-            <w:pPr>
-              <w:spacing w:after="40"/>
-              <w:jc w:val="left"/>
-            </w:pPr>
-            <w:r>
-              <w:t>RE-10</w:t>
-            </w:r>
-          </w:p>
-        </w:tc>
-        <w:tc>
-          <w:tcPr>
-            <w:tcW w:w="3745" w:type="pct"/>
-          </w:tcPr>
-          <w:p>
-            <w:pPr>
-              <w:spacing w:after="40"/>
-              <w:jc w:val="left"/>
-            </w:pPr>
-            <w:r>
-              <w:rPr>
-                <w:b/>
-                <w:bCs/>
-              </w:rPr>
-              <w:t>O sistema não se integra ao sistema da administradora do condomínio.</w:t>
-            </w:r>
-            <w:r>
-              <w:t xml:space="preserve"> O resultado do fechamento é obtido em tela e exportável, e o lançamento na cota é feito fora do sistema.</w:t>
-            </w:r>
-          </w:p>
-        </w:tc>
-        <w:tc>
-          <w:tcPr>
-            <w:tcW w:w="768" w:type="pct"/>
-          </w:tcPr>
-          <w:p>
-            <w:pPr>
-              <w:spacing w:after="40"/>
-              <w:jc w:val="left"/>
-            </w:pPr>
-            <w:r>
-              <w:t>Interface</w:t>
-            </w:r>
-          </w:p>
-        </w:tc>
-      </w:tr>
-      <w:tr>
-        <w:trPr>
-          <w:cantSplit/>
-        </w:trPr>
-        <w:tc>
-          <w:tcPr>
-            <w:tcW w:w="487" w:type="pct"/>
-          </w:tcPr>
-          <w:p>
-            <w:pPr>
-              <w:spacing w:after="40"/>
-              <w:jc w:val="left"/>
-            </w:pPr>
-            <w:r>
-              <w:t>RE-11</w:t>
-            </w:r>
-          </w:p>
-        </w:tc>
-        <w:tc>
-          <w:tcPr>
-            <w:tcW w:w="3745" w:type="pct"/>
-          </w:tcPr>
-          <w:p>
-            <w:pPr>
-              <w:spacing w:after="40"/>
-              <w:jc w:val="left"/>
-            </w:pPr>
-            <w:r>
-              <w:rPr>
-                <w:b/>
-                <w:bCs/>
-              </w:rPr>
-              <w:t>A duração máxima de uma sessão de recarga é de 6 horas.</w:t>
-            </w:r>
-            <w:r>
-              <w:t xml:space="preserve"> Atingido o limite, o sistema </w:t>
-            </w:r>
-            <w:r>
-              <w:rPr>
-                <w:b/>
-                <w:bCs/>
-              </w:rPr>
-              <w:t>sinaliza a sessão como excedida</w:t>
-            </w:r>
-            <w:r>
-              <w:t xml:space="preserve"> no painel e a mantém aberta, </w:t>
-            </w:r>
-            <w:r>
-              <w:rPr>
-                <w:b/>
-                <w:bCs/>
-              </w:rPr>
-              <w:t>sem encerrá-la automaticamente</w:t>
-            </w:r>
-            <w:r>
-              <w:t>. O encerramento continua sendo do morador ou, na sua ausência, do síndico pela via administrativa.</w:t>
-            </w:r>
-          </w:p>
-        </w:tc>
-        <w:tc>
-          <w:tcPr>
-            <w:tcW w:w="768" w:type="pct"/>
-          </w:tcPr>
-          <w:p>
-            <w:pPr>
-              <w:spacing w:after="40"/>
-              <w:jc w:val="left"/>
-            </w:pPr>
-            <w:r>
-              <w:t>Funcionalidade</w:t>
-            </w:r>
-          </w:p>
-        </w:tc>
-      </w:tr>
-      <w:tr>
-        <w:trPr>
-          <w:cantSplit/>
-        </w:trPr>
-        <w:tc>
-          <w:tcPr>
-            <w:tcW w:w="487" w:type="pct"/>
-          </w:tcPr>
-          <w:p>
-            <w:pPr>
-              <w:spacing w:after="40"/>
-              <w:jc w:val="left"/>
-            </w:pPr>
-            <w:r>
-              <w:t>RE-12</w:t>
-            </w:r>
-          </w:p>
-        </w:tc>
-        <w:tc>
-          <w:tcPr>
-            <w:tcW w:w="3745" w:type="pct"/>
-          </w:tcPr>
-          <w:p>
-            <w:pPr>
-              <w:spacing w:after="40"/>
-              <w:jc w:val="left"/>
-            </w:pPr>
-            <w:r>
-              <w:rPr>
-                <w:b/>
-                <w:bCs/>
-              </w:rPr>
-              <w:t>Não há agendamento nem reserva de vagas.</w:t>
-            </w:r>
-            <w:r>
-              <w:t xml:space="preserve"> O uso é por ordem de chegada: o morador consulta o painel, ocupa uma vaga livre e registra o início. O sistema informa a disponibilidade e a previsão de liberação, mas não garante vaga a ninguém.</w:t>
+              <w:t>O uso é por ordem de chegada: o morador consulta o painel, ocupa uma vaga livre e registra o início. O sistema informa a disponibilidade e a previsão de liberação, mas não garante vaga a ninguém.</w:t>
             </w:r>
           </w:p>
         </w:tc>
@@ -3382,10 +3470,10 @@
         <w:t>Sobre RE-11.</w:t>
       </w:r>
       <w:r>
-        <w:t xml:space="preserve"> As 6 horas cobrem uma recarga completa na maioria dos carregadores </w:t>
+        <w:t xml:space="preserve"> As 6 horas cobrem uma recarga completa na maioria dos carregadores residenciais: uma bateria de 55 kWh, de 20% a 100%, leva cerca de 6 horas em um carregador de 7,4 kW e 4 horas em um de 11 kW. Em carregadores de 3,7 kW a carga não se completa dentro do </w:t>
       </w:r>
       <w:r>
-        <w:t xml:space="preserve">residenciais: uma bateria de 55 kWh, de 20% a 100%, leva cerca de 6 horas em um carregador de 7,4 kW e 4 horas em um de 11 kW. Em carregadores de 3,7 kW a carga não se completa dentro do limite, e a recarga é concluída em mais de uma sessão. O sistema </w:t>
+        <w:t xml:space="preserve">limite, e a recarga é concluída em mais de uma sessão. O sistema </w:t>
       </w:r>
       <w:r>
         <w:rPr>
@@ -3395,10 +3483,7 @@
         <w:t>sinaliza em vez de encerrar</w:t>
       </w:r>
       <w:r>
-        <w:t xml:space="preserve"> porque o encerramento automático exibiria como livre uma vaga fisicamente ocupada, o mesmo defeito que o sistema combate; o custo dessa escolha é depender de intervenção humana. Sem o </w:t>
-      </w:r>
-      <w:r>
-        <w:t xml:space="preserve">agendamento, RE-11 e a sinalização no painel são o </w:t>
+        <w:t xml:space="preserve"> porque o encerramento automático exibiria como livre uma vaga fisicamente ocupada, o mesmo defeito que o sistema combate; o custo dessa escolha é depender de intervenção humana. Sem o agendamento, RE-11 e a sinalização no painel são o </w:t>
       </w:r>
       <w:r>
         <w:rPr>
@@ -3663,7 +3748,11 @@
               <w:jc w:val="left"/>
             </w:pPr>
             <w:r>
-              <w:t>RE-16</w:t>
+              <w:t>RE-</w:t>
+            </w:r>
+            <w:r>
+              <w:lastRenderedPageBreak/>
+              <w:t>16</w:t>
             </w:r>
           </w:p>
         </w:tc>
@@ -3677,7 +3766,12 @@
               <w:jc w:val="left"/>
             </w:pPr>
             <w:r>
-              <w:t>Não há cliente externo disponível para elicitação e validação de requisitos; o Product Owner atua como representante do cliente.</w:t>
+              <w:lastRenderedPageBreak/>
+              <w:t xml:space="preserve">Não há cliente externo disponível para elicitação e validação de requisitos; o Product </w:t>
+            </w:r>
+            <w:r>
+              <w:lastRenderedPageBreak/>
+              <w:t>Owner atua como representante do cliente.</w:t>
             </w:r>
           </w:p>
         </w:tc>
@@ -3691,6 +3785,7 @@
               <w:jc w:val="left"/>
             </w:pPr>
             <w:r>
+              <w:lastRenderedPageBreak/>
               <w:t>Projeto</w:t>
             </w:r>
           </w:p>
@@ -3704,7 +3799,6 @@
       <w:bookmarkStart w:id="12" w:name="X49d3a7fd1a61bf7e8b653313dc8161a487b4729"/>
       <w:bookmarkEnd w:id="11"/>
       <w:r>
-        <w:lastRenderedPageBreak/>
         <w:t>Requisitos não funcionais além das restrições</w:t>
       </w:r>
     </w:p>
@@ -4018,10 +4112,7 @@
     </w:p>
     <w:p>
       <w:r>
-        <w:t xml:space="preserve">RE-05 e RE-09 determinam que o sistema conheça o mundo físico apenas pela declaração dos </w:t>
-      </w:r>
-      <w:r>
-        <w:t xml:space="preserve">moradores, nunca por medição. A tabela registra o que isso impede e o que seria possível com carregadores dotados de gestão remota, do tipo que implementa o protocolo OCPP. O cenário ideal descreve a solução completa do problema e está </w:t>
+        <w:t xml:space="preserve">RE-05 e RE-09 determinam que o sistema conheça o mundo físico apenas pela declaração dos moradores, nunca por medição. A tabela registra o que isso impede e o que seria possível com carregadores dotados de gestão remota, do tipo que implementa o protocolo OCPP. O cenário ideal descreve a solução completa do problema e está </w:t>
       </w:r>
       <w:r>
         <w:rPr>
@@ -4618,7 +4709,11 @@
               <w:t>Sessão órfã</w:t>
             </w:r>
             <w:r>
-              <w:t>: o morador retira o veículo sem encerrar a sessão.</w:t>
+              <w:t xml:space="preserve">: o morador retira o veículo sem </w:t>
+            </w:r>
+            <w:r>
+              <w:lastRenderedPageBreak/>
+              <w:t>encerrar a sessão.</w:t>
             </w:r>
           </w:p>
         </w:tc>
@@ -4632,7 +4727,12 @@
               <w:jc w:val="left"/>
             </w:pPr>
             <w:r>
-              <w:t>Vaga indisponível no painel; energia continua sendo estimada indevidamente.</w:t>
+              <w:lastRenderedPageBreak/>
+              <w:t xml:space="preserve">Vaga indisponível no painel; energia continua </w:t>
+            </w:r>
+            <w:r>
+              <w:lastRenderedPageBreak/>
+              <w:t>sendo estimada indevidamente.</w:t>
             </w:r>
           </w:p>
         </w:tc>
@@ -4650,17 +4750,18 @@
                 <w:b/>
                 <w:bCs/>
               </w:rPr>
+              <w:lastRenderedPageBreak/>
               <w:t>Mitigar.</w:t>
             </w:r>
             <w:r>
               <w:t xml:space="preserve"> </w:t>
             </w:r>
             <w:r>
-              <w:t xml:space="preserve">O sistema sinaliza as sessões abertas além do tempo previsto, e o síndico as encerra administrativamente. A energia é limitada pela carga que faltava, o que impede a apuração de crescer </w:t>
+              <w:t xml:space="preserve">O sistema sinaliza as sessões abertas além do tempo previsto, e o </w:t>
             </w:r>
             <w:r>
               <w:lastRenderedPageBreak/>
-              <w:t>indefinidamente.</w:t>
+              <w:t>síndico as encerra administrativamente. A energia é limitada pela carga que faltava, o que impede a apuração de crescer indefinidamente.</w:t>
             </w:r>
           </w:p>
         </w:tc>
@@ -5442,11 +5543,7 @@
               <w:t>ajuda contextual nas próprias telas</w:t>
             </w:r>
             <w:r>
-              <w:t xml:space="preserve">, dado que o morador o acessa pelo </w:t>
-            </w:r>
-            <w:r>
-              <w:lastRenderedPageBreak/>
-              <w:t>celular e sem treinamento prévio.</w:t>
+              <w:t>, dado que o morador o acessa pelo celular e sem treinamento prévio.</w:t>
             </w:r>
           </w:p>
         </w:tc>
@@ -5465,7 +5562,6 @@
               <w:jc w:val="left"/>
             </w:pPr>
             <w:r>
-              <w:lastRenderedPageBreak/>
               <w:t>Manual do Usuário - Síndico</w:t>
             </w:r>
           </w:p>
@@ -5831,7 +5927,7 @@
             <w:rPr>
               <w:b/>
             </w:rPr>
-            <w:pict w14:anchorId="0F67FDB0">
+            <w:pict w14:anchorId="35B38282">
               <v:shapetype id="_x0000_t75" coordsize="21600,21600" o:spt="75" o:preferrelative="t" path="m@4@5l@4@11@9@11@9@5xe" filled="f" stroked="f">
                 <v:stroke joinstyle="miter"/>
                 <v:formulas>
@@ -5873,7 +5969,7 @@
   <w:abstractNum w:abstractNumId="0" w15:restartNumberingAfterBreak="0">
     <w:nsid w:val="0000A990"/>
     <w:multiLevelType w:val="multilevel"/>
-    <w:tmpl w:val="0584051A"/>
+    <w:tmpl w:val="C7D823AC"/>
     <w:lvl w:ilvl="0">
       <w:numFmt w:val="bullet"/>
       <w:lvlText w:val=" "/>
@@ -6739,37 +6835,37 @@
       </w:rPr>
     </w:lvl>
   </w:abstractNum>
-  <w:num w:numId="1" w16cid:durableId="1045253923">
+  <w:num w:numId="1" w16cid:durableId="1501235601">
     <w:abstractNumId w:val="5"/>
   </w:num>
-  <w:num w:numId="2" w16cid:durableId="933586426">
+  <w:num w:numId="2" w16cid:durableId="728377847">
     <w:abstractNumId w:val="7"/>
   </w:num>
-  <w:num w:numId="3" w16cid:durableId="314915498">
+  <w:num w:numId="3" w16cid:durableId="961956991">
     <w:abstractNumId w:val="7"/>
   </w:num>
-  <w:num w:numId="4" w16cid:durableId="273831187">
+  <w:num w:numId="4" w16cid:durableId="2117285343">
     <w:abstractNumId w:val="7"/>
   </w:num>
-  <w:num w:numId="5" w16cid:durableId="1100376582">
+  <w:num w:numId="5" w16cid:durableId="1056929277">
     <w:abstractNumId w:val="7"/>
   </w:num>
-  <w:num w:numId="6" w16cid:durableId="1221551868">
+  <w:num w:numId="6" w16cid:durableId="342509756">
     <w:abstractNumId w:val="2"/>
   </w:num>
-  <w:num w:numId="7" w16cid:durableId="1373730256">
+  <w:num w:numId="7" w16cid:durableId="405804911">
     <w:abstractNumId w:val="1"/>
   </w:num>
-  <w:num w:numId="8" w16cid:durableId="1611744015">
+  <w:num w:numId="8" w16cid:durableId="1604534787">
     <w:abstractNumId w:val="3"/>
   </w:num>
-  <w:num w:numId="9" w16cid:durableId="278488364">
+  <w:num w:numId="9" w16cid:durableId="929235480">
     <w:abstractNumId w:val="6"/>
   </w:num>
-  <w:num w:numId="10" w16cid:durableId="356127853">
+  <w:num w:numId="10" w16cid:durableId="1928733354">
     <w:abstractNumId w:val="4"/>
   </w:num>
-  <w:num w:numId="11" w16cid:durableId="800196324">
+  <w:num w:numId="11" w16cid:durableId="2045906485">
     <w:abstractNumId w:val="0"/>
   </w:num>
 </w:numbering>

</xml_diff>